<commit_message>
feat: add PWA support with install prompt and offline capabilities
- Implemented AppMenu component for navigation and settings
- Added AppStatus component to display online/offline status and update notices
- Created BackupPanel for downloading and restoring user data
- Developed InfoPages for About, How to Use, and Disclaimer sections
- Introduced hooks for handling install prompts and online status
- Added app information module for versioning and developer details
- Implemented backup and restore functionality for user tracks
- Secured API keys with encryption for enhanced privacy
</commit_message>
<xml_diff>
--- a/docs/Presentation-Talking-Notes.docx
+++ b/docs/Presentation-Talking-Notes.docx
@@ -679,7 +679,7 @@
         <w:spacing w:after="60"/>
       </w:pPr>
       <w:r>
-        <w:t>Runs entirely in a browser tab. No backend, no database, no account.</w:t>
+        <w:t xml:space="preserve">Runs in the browser and installs like an app on a phone or laptop. No backend, no database, no account.</w:t>
       </w:r>
     </w:p>
     <w:p>
@@ -688,7 +688,7 @@
         <w:spacing w:after="60"/>
       </w:pPr>
       <w:r>
-        <w:t>Works with any major AI provider - free ones included - and you can switch mid-course.</w:t>
+        <w:t xml:space="preserve">Works with any major AI provider - Google Gemini's free tier is the default - and you can switch mid-course.</w:t>
       </w:r>
     </w:p>
     <w:p>
@@ -908,6 +908,56 @@
     </w:p>
     <w:p>
       <w:pPr>
+        <w:pStyle w:val="ListBullet"/>
+        <w:spacing w:after="60"/>
+      </w:pPr>
+      <w:r>
+        <w:t xml:space="preserve">Finish on the </w:t>
+      </w:r>
+      <w:r>
+        <w:rPr>
+          <w:b/>
+        </w:rPr>
+        <w:t xml:space="preserve">☰ menu</w:t>
+      </w:r>
+      <w:r>
+        <w:t xml:space="preserve">: show </w:t>
+      </w:r>
+      <w:r>
+        <w:rPr>
+          <w:b/>
+        </w:rPr>
+        <w:t xml:space="preserve">Install app</w:t>
+      </w:r>
+      <w:r>
+        <w:t xml:space="preserve"> (or Add to Home Screen on a phone) and </w:t>
+      </w:r>
+      <w:r>
+        <w:rPr>
+          <w:b/>
+        </w:rPr>
+        <w:t xml:space="preserve">Back up &amp; restore</w:t>
+      </w:r>
+      <w:r>
+        <w:t xml:space="preserve">.</w:t>
+      </w:r>
+    </w:p>
+    <w:p>
+      <w:pPr>
+        <w:spacing w:after="160"/>
+        <w:ind w:left="432"/>
+      </w:pPr>
+      <w:r>
+        <w:rPr>
+          <w:i/>
+          <w:color w:val="4F46E5"/>
+          <w:sz w:val="22"/>
+        </w:rPr>
+        <w:t xml:space="preserve">"It installs like an app, opens offline, and your API key is encrypted on your device - it never ships in the app."</w:t>
+      </w:r>
+    </w:p>
+    <w:p>
+      <w:pPr>
         <w:pStyle w:val="Heading2"/>
       </w:pPr>
       <w:r>
@@ -980,6 +1030,21 @@
     </w:p>
     <w:p>
       <w:pPr>
+        <w:pStyle w:val="ListBullet"/>
+        <w:spacing w:after="60"/>
+      </w:pPr>
+      <w:r>
+        <w:rPr>
+          <w:b/>
+        </w:rPr>
+        <w:t xml:space="preserve">Private by design: </w:t>
+      </w:r>
+      <w:r>
+        <w:t xml:space="preserve">an installable PWA that works offline. The API key is encrypted with a Web Crypto key the app can use but never read out, and no key ever ships in the build.</w:t>
+      </w:r>
+    </w:p>
+    <w:p>
+      <w:pPr>
         <w:pStyle w:val="Heading2"/>
       </w:pPr>
       <w:r>
@@ -987,7 +1052,7 @@
           <w:rFonts w:ascii="Calibri" w:hAnsi="Calibri"/>
           <w:color w:val="0F172A"/>
         </w:rPr>
-        <w:t>How we actually use Claude (the prompt story)</w:t>
+        <w:t xml:space="preserve">How we actually use the AI (the prompt story)</w:t>
       </w:r>
     </w:p>
     <w:p>
@@ -1245,7 +1310,7 @@
           <w:color w:val="0F172A"/>
           <w:sz w:val="22"/>
         </w:rPr>
-        <w:t>Claude-specific features we lean on:</w:t>
+        <w:t xml:space="preserve">Claude-specific features we lean on (when Claude is the chosen provider):</w:t>
       </w:r>
     </w:p>
     <w:p>
@@ -1275,7 +1340,7 @@
         <w:spacing w:after="60"/>
       </w:pPr>
       <w:r>
-        <w:t>~4,400 lines of TypeScript, ~40 files - one developer can own it.</w:t>
+        <w:t xml:space="preserve">~5,400 lines of TypeScript, 48 files - one developer can own it.</w:t>
       </w:r>
     </w:p>
     <w:p>
@@ -1293,7 +1358,7 @@
         <w:spacing w:after="60"/>
       </w:pPr>
       <w:r>
-        <w:t>54 automated checks passing, run against a fake AI server - no token spend to test.</w:t>
+        <w:t xml:space="preserve">Installable PWA: opens offline and updates itself; the API key is AES-256 encrypted on the device.</w:t>
       </w:r>
     </w:p>
     <w:p>
@@ -1302,7 +1367,7 @@
         <w:spacing w:after="60"/>
       </w:pPr>
       <w:r>
-        <w:t>Free tiers cover normal use; paid providers cost a few cents per module.</w:t>
+        <w:t xml:space="preserve">Free tiers cover normal use (Gemini is the default); paid providers cost a few cents per module.</w:t>
       </w:r>
     </w:p>
     <w:p>
@@ -1328,7 +1393,7 @@
           <w:color w:val="4F46E5"/>
           <w:sz w:val="22"/>
         </w:rPr>
-        <w:t>"One honest limitation: the API key currently sits in the browser, so today it is a personal tool. Making it shareable is a small, known change - one serverless function holds the key."</w:t>
+        <w:t xml:space="preserve">"One honest limitation: every learner needs their own AI key. Gemini's is free and takes a minute, and the app keeps it encrypted on the device. If we want people to use it with no key at all, that is one small serverless function."</w:t>
       </w:r>
     </w:p>
     <w:p>
@@ -1402,7 +1467,7 @@
           <w:color w:val="475569"/>
           <w:sz w:val="22"/>
         </w:rPr>
-        <w:t>A: Learner data stays in the browser. Prompts go only to the provider you choose. On free tiers some providers may train on prompts, and the app says so next to each one. Use a paid provider or our own gateway if that matters.</w:t>
+        <w:t xml:space="preserve">A: Learner data stays on the device, and backups are a file the learner keeps. Prompts go only to the provider you choose. On free tiers some providers may train on prompts, and the app says so next to each one. Use a paid provider or our own gateway if that matters.</w:t>
       </w:r>
     </w:p>
     <w:p>
@@ -1430,7 +1495,7 @@
           <w:color w:val="475569"/>
           <w:sz w:val="22"/>
         </w:rPr>
-        <w:t>A: Nothing to host - it is a static site. AI usage is free-tier for normal learning, or a few cents per module on a paid provider. Effort is set to low by default to keep usage down.</w:t>
+        <w:t xml:space="preserve">A: Nothing to host - it is a static site, free on Vercel. AI usage is free-tier for normal learning, or a few cents per module on a paid provider. Effort is set to low by default to keep usage down.</w:t>
       </w:r>
     </w:p>
     <w:p>
@@ -1542,7 +1607,7 @@
           <w:color w:val="475569"/>
           <w:sz w:val="22"/>
         </w:rPr>
-        <w:t>A: The key proxy is the only blocker - a small serverless function. Accounts and cross-device sync are the step after, and the storage layer is already isolated for that.</w:t>
+        <w:t xml:space="preserve">A: It is ready now: host the static build (Vercel is free) and people install it from the browser, each with their own free Gemini key. A shared key proxy, accounts and cross-device sync are the steps after - the storage layer is already isolated for that.</w:t>
       </w:r>
     </w:p>
     <w:p>
@@ -1575,6 +1640,90 @@
     </w:p>
     <w:p>
       <w:pPr>
+        <w:spacing w:after="40"/>
+      </w:pPr>
+      <w:r>
+        <w:rPr>
+          <w:b/>
+          <w:i w:val="0"/>
+          <w:color w:val="0F172A"/>
+          <w:sz w:val="22"/>
+        </w:rPr>
+        <w:t xml:space="preserve">Q: Is the API key safe in the browser?</w:t>
+      </w:r>
+    </w:p>
+    <w:p>
+      <w:pPr>
+        <w:spacing w:after="160"/>
+      </w:pPr>
+      <w:r>
+        <w:rPr>
+          <w:b w:val="0"/>
+          <w:i w:val="0"/>
+          <w:color w:val="475569"/>
+          <w:sz w:val="22"/>
+        </w:rPr>
+        <w:t xml:space="preserve">A: It is encrypted with AES-GCM using a device key the app can use but never read out. It is never in the code, the build or a backup, and it is sent only to the chosen AI provider.</w:t>
+      </w:r>
+    </w:p>
+    <w:p>
+      <w:pPr>
+        <w:spacing w:after="40"/>
+      </w:pPr>
+      <w:r>
+        <w:rPr>
+          <w:b/>
+          <w:i w:val="0"/>
+          <w:color w:val="0F172A"/>
+          <w:sz w:val="22"/>
+        </w:rPr>
+        <w:t xml:space="preserve">Q: Can it go on the Play Store or App Store?</w:t>
+      </w:r>
+    </w:p>
+    <w:p>
+      <w:pPr>
+        <w:spacing w:after="160"/>
+      </w:pPr>
+      <w:r>
+        <w:rPr>
+          <w:b w:val="0"/>
+          <w:i w:val="0"/>
+          <w:color w:val="475569"/>
+          <w:sz w:val="22"/>
+        </w:rPr>
+        <w:t xml:space="preserve">A: Android: yes - PWABuilder turns the hosted app into a Play Store package. iPhone: people add it to the home screen from Safari today; the App Store would need a native wrapper.</w:t>
+      </w:r>
+    </w:p>
+    <w:p>
+      <w:pPr>
+        <w:spacing w:after="40"/>
+      </w:pPr>
+      <w:r>
+        <w:rPr>
+          <w:b/>
+          <w:i w:val="0"/>
+          <w:color w:val="0F172A"/>
+          <w:sz w:val="22"/>
+        </w:rPr>
+        <w:t xml:space="preserve">Q: Who built it?</w:t>
+      </w:r>
+    </w:p>
+    <w:p>
+      <w:pPr>
+        <w:spacing w:after="160"/>
+      </w:pPr>
+      <w:r>
+        <w:rPr>
+          <w:b w:val="0"/>
+          <w:i w:val="0"/>
+          <w:color w:val="475569"/>
+          <w:sz w:val="22"/>
+        </w:rPr>
+        <w:t xml:space="preserve">A: Designed and developed by Sohel Pathan.</w:t>
+      </w:r>
+    </w:p>
+    <w:p>
+      <w:pPr>
         <w:spacing w:after="200"/>
         <w:pBdr>
           <w:bottom w:val="single" w:sz="6" w:space="1" w:color="D9DEE7"/>
@@ -1634,7 +1783,7 @@
         <w:spacing w:after="60"/>
       </w:pPr>
       <w:r>
-        <w:t>Runs in a browser, works with free AI, switch providers any time.</w:t>
+        <w:t xml:space="preserve">Installs like an app, works with free AI (Gemini by default), and keeps your key encrypted.</w:t>
       </w:r>
     </w:p>
     <w:p>
@@ -1644,6 +1793,20 @@
       </w:pPr>
       <w:r>
         <w:t>Demo the profile screen - the mastery bars tell the story faster than any slide.</w:t>
+      </w:r>
+    </w:p>
+    <w:p>
+      <w:pPr>
+        <w:spacing w:after="200"/>
+      </w:pPr>
+      <w:r>
+        <w:rPr>
+          <w:b w:val="0"/>
+          <w:i/>
+          <w:color w:val="475569"/>
+          <w:sz w:val="22"/>
+        </w:rPr>
+        <w:t xml:space="preserve">SkillPath - designed and developed by Sohel Pathan. © 2026 Sohel Pathan. All rights reserved.</w:t>
       </w:r>
     </w:p>
     <w:sectPr>

</xml_diff>